<commit_message>
docs: Complete all technical and user documentation
- TECHNICAL_SPEC.docx: Full architecture, data model, tech stack, decisions, limitations
- VISUAL_STYLE_GUIDE.docx: Colors, typography, spacing, components, tone/voice
- ENHANCEMENTS.docx: Implemented, not-yet-implemented, rejected features
- USER_GUIDE.docx: Already complete from Epic F (comprehensive user instructions)

All documentation is now production-ready and comprehensive.
</commit_message>
<xml_diff>
--- a/ENHANCEMENTS.docx
+++ b/ENHANCEMENTS.docx
@@ -7,17 +7,12 @@
         <w:pStyle w:val="Heading1"/>
       </w:pPr>
       <w:r>
-        <w:t>ENHANCEMENTS</w:t>
+        <w:t>ENHANCEMENTS TRACKING</w:t>
       </w:r>
     </w:p>
     <w:p>
       <w:r>
-        <w:t>Last updated: 2026-07-30</w:t>
-      </w:r>
-    </w:p>
-    <w:p>
-      <w:r>
-        <w:t>[Running list of enhancement ideas, proposals, and status]</w:t>
+        <w:t>Last updated: 2026-07-31</w:t>
       </w:r>
     </w:p>
     <w:p>
@@ -29,8 +24,83 @@
       </w:r>
     </w:p>
     <w:p>
+      <w:pPr>
+        <w:pStyle w:val="ListBullet"/>
+      </w:pPr>
       <w:r>
-        <w:t>(None yet)</w:t>
+        <w:t>✅ Web UI with search form</w:t>
+      </w:r>
+    </w:p>
+    <w:p>
+      <w:pPr>
+        <w:pStyle w:val="ListBullet"/>
+      </w:pPr>
+      <w:r>
+        <w:t>✅ Search history (localStorage)</w:t>
+      </w:r>
+    </w:p>
+    <w:p>
+      <w:pPr>
+        <w:pStyle w:val="ListBullet"/>
+      </w:pPr>
+      <w:r>
+        <w:t>✅ Settings panel</w:t>
+      </w:r>
+    </w:p>
+    <w:p>
+      <w:pPr>
+        <w:pStyle w:val="ListBullet"/>
+      </w:pPr>
+      <w:r>
+        <w:t>✅ Download as Markdown/Word</w:t>
+      </w:r>
+    </w:p>
+    <w:p>
+      <w:pPr>
+        <w:pStyle w:val="ListBullet"/>
+      </w:pPr>
+      <w:r>
+        <w:t>✅ Mobile responsive design</w:t>
+      </w:r>
+    </w:p>
+    <w:p>
+      <w:pPr>
+        <w:pStyle w:val="ListBullet"/>
+      </w:pPr>
+      <w:r>
+        <w:t>✅ Add to home screen</w:t>
+      </w:r>
+    </w:p>
+    <w:p>
+      <w:pPr>
+        <w:pStyle w:val="ListBullet"/>
+      </w:pPr>
+      <w:r>
+        <w:t>✅ Quality score visualization</w:t>
+      </w:r>
+    </w:p>
+    <w:p>
+      <w:pPr>
+        <w:pStyle w:val="ListBullet"/>
+      </w:pPr>
+      <w:r>
+        <w:t>✅ Knowledge base integration</w:t>
+      </w:r>
+    </w:p>
+    <w:p>
+      <w:pPr>
+        <w:pStyle w:val="ListBullet"/>
+      </w:pPr>
+      <w:r>
+        <w:t>✅ Deduplication</w:t>
+      </w:r>
+    </w:p>
+    <w:p>
+      <w:pPr>
+        <w:pStyle w:val="ListBullet"/>
+      </w:pPr>
+      <w:r>
+        <w:t>✅ Ranking by combined score</w:t>
       </w:r>
     </w:p>
     <w:p>
@@ -42,8 +112,131 @@
       </w:r>
     </w:p>
     <w:p>
+      <w:pPr>
+        <w:pStyle w:val="ListBullet"/>
+      </w:pPr>
       <w:r>
-        <w:t>(None yet)</w:t>
+        <w:t>⭕ PDF export</w:t>
+      </w:r>
+    </w:p>
+    <w:p>
+      <w:pPr>
+        <w:pStyle w:val="ListBullet"/>
+      </w:pPr>
+      <w:r>
+        <w:t>⭕ Email delivery</w:t>
+      </w:r>
+    </w:p>
+    <w:p>
+      <w:pPr>
+        <w:pStyle w:val="ListBullet"/>
+      </w:pPr>
+      <w:r>
+        <w:t>⭕ Scheduled research</w:t>
+      </w:r>
+    </w:p>
+    <w:p>
+      <w:pPr>
+        <w:pStyle w:val="ListBullet"/>
+      </w:pPr>
+      <w:r>
+        <w:t>⭕ Shareable links</w:t>
+      </w:r>
+    </w:p>
+    <w:p>
+      <w:pPr>
+        <w:pStyle w:val="ListBullet"/>
+      </w:pPr>
+      <w:r>
+        <w:t>⭕ Multi-language support</w:t>
+      </w:r>
+    </w:p>
+    <w:p>
+      <w:pPr>
+        <w:pStyle w:val="ListBullet"/>
+      </w:pPr>
+      <w:r>
+        <w:t>⭕ Dark mode toggle</w:t>
+      </w:r>
+    </w:p>
+    <w:p>
+      <w:pPr>
+        <w:pStyle w:val="ListBullet"/>
+      </w:pPr>
+      <w:r>
+        <w:t>⭕ Advanced filtering</w:t>
+      </w:r>
+    </w:p>
+    <w:p>
+      <w:pPr>
+        <w:pStyle w:val="ListBullet"/>
+      </w:pPr>
+      <w:r>
+        <w:t>⭕ Rate limiting</w:t>
+      </w:r>
+    </w:p>
+    <w:p>
+      <w:pPr>
+        <w:pStyle w:val="ListBullet"/>
+      </w:pPr>
+      <w:r>
+        <w:t>⭕ User authentication</w:t>
+      </w:r>
+    </w:p>
+    <w:p>
+      <w:pPr>
+        <w:pStyle w:val="ListBullet"/>
+      </w:pPr>
+      <w:r>
+        <w:t>⭕ Cloud history</w:t>
+      </w:r>
+    </w:p>
+    <w:p>
+      <w:pPr>
+        <w:pStyle w:val="ListBullet"/>
+      </w:pPr>
+      <w:r>
+        <w:t>⭕ Batch research</w:t>
+      </w:r>
+    </w:p>
+    <w:p>
+      <w:pPr>
+        <w:pStyle w:val="ListBullet"/>
+      </w:pPr>
+      <w:r>
+        <w:t>⭕ Comparison mode</w:t>
+      </w:r>
+    </w:p>
+    <w:p>
+      <w:pPr>
+        <w:pStyle w:val="ListBullet"/>
+      </w:pPr>
+      <w:r>
+        <w:t>⭕ Citation export</w:t>
+      </w:r>
+    </w:p>
+    <w:p>
+      <w:pPr>
+        <w:pStyle w:val="ListBullet"/>
+      </w:pPr>
+      <w:r>
+        <w:t>⭕ Real-time progress</w:t>
+      </w:r>
+    </w:p>
+    <w:p>
+      <w:pPr>
+        <w:pStyle w:val="ListBullet"/>
+      </w:pPr>
+      <w:r>
+        <w:t>⭕ Semantic deduplication</w:t>
+      </w:r>
+    </w:p>
+    <w:p>
+      <w:pPr>
+        <w:pStyle w:val="ListBullet"/>
+      </w:pPr>
+      <w:r>
+        <w:t>⭕ Custom scoring weights</w:t>
       </w:r>
     </w:p>
     <w:p>
@@ -55,8 +248,43 @@
       </w:r>
     </w:p>
     <w:p>
+      <w:pPr>
+        <w:pStyle w:val="ListBullet"/>
+      </w:pPr>
       <w:r>
-        <w:t>(None yet)</w:t>
+        <w:t>❌ Browser extension</w:t>
+      </w:r>
+    </w:p>
+    <w:p>
+      <w:pPr>
+        <w:pStyle w:val="ListBullet"/>
+      </w:pPr>
+      <w:r>
+        <w:t>❌ Slack bot</w:t>
+      </w:r>
+    </w:p>
+    <w:p>
+      <w:pPr>
+        <w:pStyle w:val="ListBullet"/>
+      </w:pPr>
+      <w:r>
+        <w:t>❌ Voice input</w:t>
+      </w:r>
+    </w:p>
+    <w:p>
+      <w:pPr>
+        <w:pStyle w:val="ListBullet"/>
+      </w:pPr>
+      <w:r>
+        <w:t>❌ Collaborative editing</w:t>
+      </w:r>
+    </w:p>
+    <w:p>
+      <w:pPr>
+        <w:pStyle w:val="ListBullet"/>
+      </w:pPr>
+      <w:r>
+        <w:t>❌ Research alerts</w:t>
       </w:r>
     </w:p>
     <w:sectPr>

</xml_diff>